<commit_message>
Correct primary manuscript tables titling: remove erroneous Supplementary Table prefix, label cleanly as Table 1 to Table 8, and organize into manuscript/tables/
</commit_message>
<xml_diff>
--- a/supplementary/tables_word/Table_1_Dataset_Summary.docx
+++ b/supplementary/tables_word/Table_1_Dataset_Summary.docx
@@ -4,23 +4,7 @@
   <w:body>
     <w:p>
       <w:pPr>
-        <w:spacing w:before="80" w:after="80" w:line="276" w:lineRule="auto"/>
-        <w:jc w:val="both"/>
-      </w:pPr>
-      <w:r>
-        <w:rPr>
-          <w:rFonts w:ascii="Times New Roman" w:hAnsi="Times New Roman"/>
-          <w:b/>
-          <w:i w:val="0"/>
-          <w:color w:val="000000"/>
-          <w:sz w:val="24"/>
-        </w:rPr>
-        <w:t>Supplementary Table S1</w:t>
-      </w:r>
-    </w:p>
-    <w:p>
-      <w:pPr>
-        <w:spacing w:before="80" w:after="80" w:line="276" w:lineRule="auto"/>
+        <w:spacing w:before="0" w:after="120" w:line="276" w:lineRule="auto"/>
         <w:jc w:val="both"/>
       </w:pPr>
       <w:r>
@@ -62,10 +46,10 @@
             <w:tcW w:type="dxa" w:w="4680"/>
             <w:vAlign w:val="center"/>
             <w:tcMar>
-              <w:top w:w="90" w:type="dxa"/>
-              <w:bottom w:w="90" w:type="dxa"/>
-              <w:left w:w="130" w:type="dxa"/>
-              <w:right w:w="130" w:type="dxa"/>
+              <w:top w:w="70" w:type="dxa"/>
+              <w:bottom w:w="70" w:type="dxa"/>
+              <w:left w:w="100" w:type="dxa"/>
+              <w:right w:w="100" w:type="dxa"/>
             </w:tcMar>
           </w:tcPr>
           <w:p>
@@ -79,7 +63,7 @@
                 <w:rFonts w:ascii="Times New Roman" w:hAnsi="Times New Roman"/>
                 <w:b/>
                 <w:color w:val="000000"/>
-                <w:sz w:val="20"/>
+                <w:sz w:val="19"/>
               </w:rPr>
               <w:t>Metric / Parameter</w:t>
             </w:r>
@@ -90,10 +74,10 @@
             <w:tcW w:type="dxa" w:w="4680"/>
             <w:vAlign w:val="center"/>
             <w:tcMar>
-              <w:top w:w="90" w:type="dxa"/>
-              <w:bottom w:w="90" w:type="dxa"/>
-              <w:left w:w="130" w:type="dxa"/>
-              <w:right w:w="130" w:type="dxa"/>
+              <w:top w:w="70" w:type="dxa"/>
+              <w:bottom w:w="70" w:type="dxa"/>
+              <w:left w:w="100" w:type="dxa"/>
+              <w:right w:w="100" w:type="dxa"/>
             </w:tcMar>
           </w:tcPr>
           <w:p>
@@ -107,7 +91,7 @@
                 <w:rFonts w:ascii="Times New Roman" w:hAnsi="Times New Roman"/>
                 <w:b/>
                 <w:color w:val="000000"/>
-                <w:sz w:val="20"/>
+                <w:sz w:val="19"/>
               </w:rPr>
               <w:t>Value / Description</w:t>
             </w:r>
@@ -120,10 +104,10 @@
             <w:tcW w:type="dxa" w:w="4680"/>
             <w:vAlign w:val="center"/>
             <w:tcMar>
-              <w:top w:w="90" w:type="dxa"/>
-              <w:bottom w:w="90" w:type="dxa"/>
-              <w:left w:w="130" w:type="dxa"/>
-              <w:right w:w="130" w:type="dxa"/>
+              <w:top w:w="70" w:type="dxa"/>
+              <w:bottom w:w="70" w:type="dxa"/>
+              <w:left w:w="100" w:type="dxa"/>
+              <w:right w:w="100" w:type="dxa"/>
             </w:tcMar>
           </w:tcPr>
           <w:p>
@@ -137,7 +121,7 @@
                 <w:rFonts w:ascii="Times New Roman" w:hAnsi="Times New Roman"/>
                 <w:b w:val="0"/>
                 <w:color w:val="000000"/>
-                <w:sz w:val="20"/>
+                <w:sz w:val="19"/>
               </w:rPr>
               <w:t>Organism</w:t>
             </w:r>
@@ -148,10 +132,10 @@
             <w:tcW w:type="dxa" w:w="4680"/>
             <w:vAlign w:val="center"/>
             <w:tcMar>
-              <w:top w:w="90" w:type="dxa"/>
-              <w:bottom w:w="90" w:type="dxa"/>
-              <w:left w:w="130" w:type="dxa"/>
-              <w:right w:w="130" w:type="dxa"/>
+              <w:top w:w="70" w:type="dxa"/>
+              <w:bottom w:w="70" w:type="dxa"/>
+              <w:left w:w="100" w:type="dxa"/>
+              <w:right w:w="100" w:type="dxa"/>
             </w:tcMar>
           </w:tcPr>
           <w:p>
@@ -165,7 +149,7 @@
                 <w:rFonts w:ascii="Times New Roman" w:hAnsi="Times New Roman"/>
                 <w:b w:val="0"/>
                 <w:color w:val="000000"/>
-                <w:sz w:val="20"/>
+                <w:sz w:val="19"/>
               </w:rPr>
               <w:t>Homo sapiens (Human)</w:t>
             </w:r>
@@ -178,10 +162,10 @@
             <w:tcW w:type="dxa" w:w="4680"/>
             <w:vAlign w:val="center"/>
             <w:tcMar>
-              <w:top w:w="90" w:type="dxa"/>
-              <w:bottom w:w="90" w:type="dxa"/>
-              <w:left w:w="130" w:type="dxa"/>
-              <w:right w:w="130" w:type="dxa"/>
+              <w:top w:w="70" w:type="dxa"/>
+              <w:bottom w:w="70" w:type="dxa"/>
+              <w:left w:w="100" w:type="dxa"/>
+              <w:right w:w="100" w:type="dxa"/>
             </w:tcMar>
           </w:tcPr>
           <w:p>
@@ -195,7 +179,7 @@
                 <w:rFonts w:ascii="Times New Roman" w:hAnsi="Times New Roman"/>
                 <w:b w:val="0"/>
                 <w:color w:val="000000"/>
-                <w:sz w:val="20"/>
+                <w:sz w:val="19"/>
               </w:rPr>
               <w:t>Breast Cancer Subtype</w:t>
             </w:r>
@@ -206,10 +190,10 @@
             <w:tcW w:type="dxa" w:w="4680"/>
             <w:vAlign w:val="center"/>
             <w:tcMar>
-              <w:top w:w="90" w:type="dxa"/>
-              <w:bottom w:w="90" w:type="dxa"/>
-              <w:left w:w="130" w:type="dxa"/>
-              <w:right w:w="130" w:type="dxa"/>
+              <w:top w:w="70" w:type="dxa"/>
+              <w:bottom w:w="70" w:type="dxa"/>
+              <w:left w:w="100" w:type="dxa"/>
+              <w:right w:w="100" w:type="dxa"/>
             </w:tcMar>
           </w:tcPr>
           <w:p>
@@ -223,7 +207,7 @@
                 <w:rFonts w:ascii="Times New Roman" w:hAnsi="Times New Roman"/>
                 <w:b w:val="0"/>
                 <w:color w:val="000000"/>
-                <w:sz w:val="20"/>
+                <w:sz w:val="19"/>
               </w:rPr>
               <w:t>Triple-Negative Breast Cancer (TNBC)</w:t>
             </w:r>
@@ -236,10 +220,10 @@
             <w:tcW w:type="dxa" w:w="4680"/>
             <w:vAlign w:val="center"/>
             <w:tcMar>
-              <w:top w:w="90" w:type="dxa"/>
-              <w:bottom w:w="90" w:type="dxa"/>
-              <w:left w:w="130" w:type="dxa"/>
-              <w:right w:w="130" w:type="dxa"/>
+              <w:top w:w="70" w:type="dxa"/>
+              <w:bottom w:w="70" w:type="dxa"/>
+              <w:left w:w="100" w:type="dxa"/>
+              <w:right w:w="100" w:type="dxa"/>
             </w:tcMar>
           </w:tcPr>
           <w:p>
@@ -253,7 +237,7 @@
                 <w:rFonts w:ascii="Times New Roman" w:hAnsi="Times New Roman"/>
                 <w:b w:val="0"/>
                 <w:color w:val="000000"/>
-                <w:sz w:val="20"/>
+                <w:sz w:val="19"/>
               </w:rPr>
               <w:t>Cell Line</w:t>
             </w:r>
@@ -264,10 +248,10 @@
             <w:tcW w:type="dxa" w:w="4680"/>
             <w:vAlign w:val="center"/>
             <w:tcMar>
-              <w:top w:w="90" w:type="dxa"/>
-              <w:bottom w:w="90" w:type="dxa"/>
-              <w:left w:w="130" w:type="dxa"/>
-              <w:right w:w="130" w:type="dxa"/>
+              <w:top w:w="70" w:type="dxa"/>
+              <w:bottom w:w="70" w:type="dxa"/>
+              <w:left w:w="100" w:type="dxa"/>
+              <w:right w:w="100" w:type="dxa"/>
             </w:tcMar>
           </w:tcPr>
           <w:p>
@@ -281,7 +265,7 @@
                 <w:rFonts w:ascii="Times New Roman" w:hAnsi="Times New Roman"/>
                 <w:b w:val="0"/>
                 <w:color w:val="000000"/>
-                <w:sz w:val="20"/>
+                <w:sz w:val="19"/>
               </w:rPr>
               <w:t>MDA-MB-231</w:t>
             </w:r>
@@ -294,10 +278,10 @@
             <w:tcW w:type="dxa" w:w="4680"/>
             <w:vAlign w:val="center"/>
             <w:tcMar>
-              <w:top w:w="90" w:type="dxa"/>
-              <w:bottom w:w="90" w:type="dxa"/>
-              <w:left w:w="130" w:type="dxa"/>
-              <w:right w:w="130" w:type="dxa"/>
+              <w:top w:w="70" w:type="dxa"/>
+              <w:bottom w:w="70" w:type="dxa"/>
+              <w:left w:w="100" w:type="dxa"/>
+              <w:right w:w="100" w:type="dxa"/>
             </w:tcMar>
           </w:tcPr>
           <w:p>
@@ -311,7 +295,7 @@
                 <w:rFonts w:ascii="Times New Roman" w:hAnsi="Times New Roman"/>
                 <w:b w:val="0"/>
                 <w:color w:val="000000"/>
-                <w:sz w:val="20"/>
+                <w:sz w:val="19"/>
               </w:rPr>
               <w:t>CRISPR Perturbation Modality</w:t>
             </w:r>
@@ -322,10 +306,10 @@
             <w:tcW w:type="dxa" w:w="4680"/>
             <w:vAlign w:val="center"/>
             <w:tcMar>
-              <w:top w:w="90" w:type="dxa"/>
-              <w:bottom w:w="90" w:type="dxa"/>
-              <w:left w:w="130" w:type="dxa"/>
-              <w:right w:w="130" w:type="dxa"/>
+              <w:top w:w="70" w:type="dxa"/>
+              <w:bottom w:w="70" w:type="dxa"/>
+              <w:left w:w="100" w:type="dxa"/>
+              <w:right w:w="100" w:type="dxa"/>
             </w:tcMar>
           </w:tcPr>
           <w:p>
@@ -339,7 +323,7 @@
                 <w:rFonts w:ascii="Times New Roman" w:hAnsi="Times New Roman"/>
                 <w:b w:val="0"/>
                 <w:color w:val="000000"/>
-                <w:sz w:val="20"/>
+                <w:sz w:val="19"/>
               </w:rPr>
               <w:t>CRISPR interference (CRISPRi / dCas9-KRAB)</w:t>
             </w:r>
@@ -352,10 +336,10 @@
             <w:tcW w:type="dxa" w:w="4680"/>
             <w:vAlign w:val="center"/>
             <w:tcMar>
-              <w:top w:w="90" w:type="dxa"/>
-              <w:bottom w:w="90" w:type="dxa"/>
-              <w:left w:w="130" w:type="dxa"/>
-              <w:right w:w="130" w:type="dxa"/>
+              <w:top w:w="70" w:type="dxa"/>
+              <w:bottom w:w="70" w:type="dxa"/>
+              <w:left w:w="100" w:type="dxa"/>
+              <w:right w:w="100" w:type="dxa"/>
             </w:tcMar>
           </w:tcPr>
           <w:p>
@@ -369,7 +353,7 @@
                 <w:rFonts w:ascii="Times New Roman" w:hAnsi="Times New Roman"/>
                 <w:b w:val="0"/>
                 <w:color w:val="000000"/>
-                <w:sz w:val="20"/>
+                <w:sz w:val="19"/>
               </w:rPr>
               <w:t>Screen Type</w:t>
             </w:r>
@@ -380,10 +364,10 @@
             <w:tcW w:type="dxa" w:w="4680"/>
             <w:vAlign w:val="center"/>
             <w:tcMar>
-              <w:top w:w="90" w:type="dxa"/>
-              <w:bottom w:w="90" w:type="dxa"/>
-              <w:left w:w="130" w:type="dxa"/>
-              <w:right w:w="130" w:type="dxa"/>
+              <w:top w:w="70" w:type="dxa"/>
+              <w:bottom w:w="70" w:type="dxa"/>
+              <w:left w:w="100" w:type="dxa"/>
+              <w:right w:w="100" w:type="dxa"/>
             </w:tcMar>
           </w:tcPr>
           <w:p>
@@ -397,7 +381,7 @@
                 <w:rFonts w:ascii="Times New Roman" w:hAnsi="Times New Roman"/>
                 <w:b w:val="0"/>
                 <w:color w:val="000000"/>
-                <w:sz w:val="20"/>
+                <w:sz w:val="19"/>
               </w:rPr>
               <w:t>Somatic Mutation Regulatory Enhancer Screen</w:t>
             </w:r>
@@ -410,10 +394,10 @@
             <w:tcW w:type="dxa" w:w="4680"/>
             <w:vAlign w:val="center"/>
             <w:tcMar>
-              <w:top w:w="90" w:type="dxa"/>
-              <w:bottom w:w="90" w:type="dxa"/>
-              <w:left w:w="130" w:type="dxa"/>
-              <w:right w:w="130" w:type="dxa"/>
+              <w:top w:w="70" w:type="dxa"/>
+              <w:bottom w:w="70" w:type="dxa"/>
+              <w:left w:w="100" w:type="dxa"/>
+              <w:right w:w="100" w:type="dxa"/>
             </w:tcMar>
           </w:tcPr>
           <w:p>
@@ -427,7 +411,7 @@
                 <w:rFonts w:ascii="Times New Roman" w:hAnsi="Times New Roman"/>
                 <w:b w:val="0"/>
                 <w:color w:val="000000"/>
-                <w:sz w:val="20"/>
+                <w:sz w:val="19"/>
               </w:rPr>
               <w:t>Total Sequenced Cells</w:t>
             </w:r>
@@ -438,10 +422,10 @@
             <w:tcW w:type="dxa" w:w="4680"/>
             <w:vAlign w:val="center"/>
             <w:tcMar>
-              <w:top w:w="90" w:type="dxa"/>
-              <w:bottom w:w="90" w:type="dxa"/>
-              <w:left w:w="130" w:type="dxa"/>
-              <w:right w:w="130" w:type="dxa"/>
+              <w:top w:w="70" w:type="dxa"/>
+              <w:bottom w:w="70" w:type="dxa"/>
+              <w:left w:w="100" w:type="dxa"/>
+              <w:right w:w="100" w:type="dxa"/>
             </w:tcMar>
           </w:tcPr>
           <w:p>
@@ -455,7 +439,7 @@
                 <w:rFonts w:ascii="Times New Roman" w:hAnsi="Times New Roman"/>
                 <w:b w:val="0"/>
                 <w:color w:val="000000"/>
-                <w:sz w:val="20"/>
+                <w:sz w:val="19"/>
               </w:rPr>
               <w:t>95,678</w:t>
             </w:r>
@@ -468,10 +452,10 @@
             <w:tcW w:type="dxa" w:w="4680"/>
             <w:vAlign w:val="center"/>
             <w:tcMar>
-              <w:top w:w="90" w:type="dxa"/>
-              <w:bottom w:w="90" w:type="dxa"/>
-              <w:left w:w="130" w:type="dxa"/>
-              <w:right w:w="130" w:type="dxa"/>
+              <w:top w:w="70" w:type="dxa"/>
+              <w:bottom w:w="70" w:type="dxa"/>
+              <w:left w:w="100" w:type="dxa"/>
+              <w:right w:w="100" w:type="dxa"/>
             </w:tcMar>
           </w:tcPr>
           <w:p>
@@ -485,7 +469,7 @@
                 <w:rFonts w:ascii="Times New Roman" w:hAnsi="Times New Roman"/>
                 <w:b w:val="0"/>
                 <w:color w:val="000000"/>
-                <w:sz w:val="20"/>
+                <w:sz w:val="19"/>
               </w:rPr>
               <w:t>Total Filtered Genes</w:t>
             </w:r>
@@ -496,10 +480,10 @@
             <w:tcW w:type="dxa" w:w="4680"/>
             <w:vAlign w:val="center"/>
             <w:tcMar>
-              <w:top w:w="90" w:type="dxa"/>
-              <w:bottom w:w="90" w:type="dxa"/>
-              <w:left w:w="130" w:type="dxa"/>
-              <w:right w:w="130" w:type="dxa"/>
+              <w:top w:w="70" w:type="dxa"/>
+              <w:bottom w:w="70" w:type="dxa"/>
+              <w:left w:w="100" w:type="dxa"/>
+              <w:right w:w="100" w:type="dxa"/>
             </w:tcMar>
           </w:tcPr>
           <w:p>
@@ -513,7 +497,7 @@
                 <w:rFonts w:ascii="Times New Roman" w:hAnsi="Times New Roman"/>
                 <w:b w:val="0"/>
                 <w:color w:val="000000"/>
-                <w:sz w:val="20"/>
+                <w:sz w:val="19"/>
               </w:rPr>
               <w:t>32,799</w:t>
             </w:r>
@@ -526,10 +510,10 @@
             <w:tcW w:type="dxa" w:w="4680"/>
             <w:vAlign w:val="center"/>
             <w:tcMar>
-              <w:top w:w="90" w:type="dxa"/>
-              <w:bottom w:w="90" w:type="dxa"/>
-              <w:left w:w="130" w:type="dxa"/>
-              <w:right w:w="130" w:type="dxa"/>
+              <w:top w:w="70" w:type="dxa"/>
+              <w:bottom w:w="70" w:type="dxa"/>
+              <w:left w:w="100" w:type="dxa"/>
+              <w:right w:w="100" w:type="dxa"/>
             </w:tcMar>
           </w:tcPr>
           <w:p>
@@ -543,7 +527,7 @@
                 <w:rFonts w:ascii="Times New Roman" w:hAnsi="Times New Roman"/>
                 <w:b w:val="0"/>
                 <w:color w:val="000000"/>
-                <w:sz w:val="20"/>
+                <w:sz w:val="19"/>
               </w:rPr>
               <w:t>Total CRISPRi Guides Preserved</w:t>
             </w:r>
@@ -554,10 +538,10 @@
             <w:tcW w:type="dxa" w:w="4680"/>
             <w:vAlign w:val="center"/>
             <w:tcMar>
-              <w:top w:w="90" w:type="dxa"/>
-              <w:bottom w:w="90" w:type="dxa"/>
-              <w:left w:w="130" w:type="dxa"/>
-              <w:right w:w="130" w:type="dxa"/>
+              <w:top w:w="70" w:type="dxa"/>
+              <w:bottom w:w="70" w:type="dxa"/>
+              <w:left w:w="100" w:type="dxa"/>
+              <w:right w:w="100" w:type="dxa"/>
             </w:tcMar>
           </w:tcPr>
           <w:p>
@@ -571,7 +555,7 @@
                 <w:rFonts w:ascii="Times New Roman" w:hAnsi="Times New Roman"/>
                 <w:b w:val="0"/>
                 <w:color w:val="000000"/>
-                <w:sz w:val="20"/>
+                <w:sz w:val="19"/>
               </w:rPr>
               <w:t>11,975</w:t>
             </w:r>
@@ -584,10 +568,10 @@
             <w:tcW w:type="dxa" w:w="4680"/>
             <w:vAlign w:val="center"/>
             <w:tcMar>
-              <w:top w:w="90" w:type="dxa"/>
-              <w:bottom w:w="90" w:type="dxa"/>
-              <w:left w:w="130" w:type="dxa"/>
-              <w:right w:w="130" w:type="dxa"/>
+              <w:top w:w="70" w:type="dxa"/>
+              <w:bottom w:w="70" w:type="dxa"/>
+              <w:left w:w="100" w:type="dxa"/>
+              <w:right w:w="100" w:type="dxa"/>
             </w:tcMar>
           </w:tcPr>
           <w:p>
@@ -601,7 +585,7 @@
                 <w:rFonts w:ascii="Times New Roman" w:hAnsi="Times New Roman"/>
                 <w:b w:val="0"/>
                 <w:color w:val="000000"/>
-                <w:sz w:val="20"/>
+                <w:sz w:val="19"/>
               </w:rPr>
               <w:t>Target Enhancer Loci</w:t>
             </w:r>
@@ -612,10 +596,10 @@
             <w:tcW w:type="dxa" w:w="4680"/>
             <w:vAlign w:val="center"/>
             <w:tcMar>
-              <w:top w:w="90" w:type="dxa"/>
-              <w:bottom w:w="90" w:type="dxa"/>
-              <w:left w:w="130" w:type="dxa"/>
-              <w:right w:w="130" w:type="dxa"/>
+              <w:top w:w="70" w:type="dxa"/>
+              <w:bottom w:w="70" w:type="dxa"/>
+              <w:left w:w="100" w:type="dxa"/>
+              <w:right w:w="100" w:type="dxa"/>
             </w:tcMar>
           </w:tcPr>
           <w:p>
@@ -629,7 +613,7 @@
                 <w:rFonts w:ascii="Times New Roman" w:hAnsi="Times New Roman"/>
                 <w:b w:val="0"/>
                 <w:color w:val="000000"/>
-                <w:sz w:val="20"/>
+                <w:sz w:val="19"/>
               </w:rPr>
               <w:t>819</w:t>
             </w:r>
@@ -642,10 +626,10 @@
             <w:tcW w:type="dxa" w:w="4680"/>
             <w:vAlign w:val="center"/>
             <w:tcMar>
-              <w:top w:w="90" w:type="dxa"/>
-              <w:bottom w:w="90" w:type="dxa"/>
-              <w:left w:w="130" w:type="dxa"/>
-              <w:right w:w="130" w:type="dxa"/>
+              <w:top w:w="70" w:type="dxa"/>
+              <w:bottom w:w="70" w:type="dxa"/>
+              <w:left w:w="100" w:type="dxa"/>
+              <w:right w:w="100" w:type="dxa"/>
             </w:tcMar>
           </w:tcPr>
           <w:p>
@@ -659,7 +643,7 @@
                 <w:rFonts w:ascii="Times New Roman" w:hAnsi="Times New Roman"/>
                 <w:b w:val="0"/>
                 <w:color w:val="000000"/>
-                <w:sz w:val="20"/>
+                <w:sz w:val="19"/>
               </w:rPr>
               <w:t>Single-Guide Perturbation Cohort (Primary Causal Analysis)</w:t>
             </w:r>
@@ -670,10 +654,10 @@
             <w:tcW w:type="dxa" w:w="4680"/>
             <w:vAlign w:val="center"/>
             <w:tcMar>
-              <w:top w:w="90" w:type="dxa"/>
-              <w:bottom w:w="90" w:type="dxa"/>
-              <w:left w:w="130" w:type="dxa"/>
-              <w:right w:w="130" w:type="dxa"/>
+              <w:top w:w="70" w:type="dxa"/>
+              <w:bottom w:w="70" w:type="dxa"/>
+              <w:left w:w="100" w:type="dxa"/>
+              <w:right w:w="100" w:type="dxa"/>
             </w:tcMar>
           </w:tcPr>
           <w:p>
@@ -687,7 +671,7 @@
                 <w:rFonts w:ascii="Times New Roman" w:hAnsi="Times New Roman"/>
                 <w:b w:val="0"/>
                 <w:color w:val="000000"/>
-                <w:sz w:val="20"/>
+                <w:sz w:val="19"/>
               </w:rPr>
               <w:t>3,930 cells</w:t>
             </w:r>
@@ -700,10 +684,10 @@
             <w:tcW w:type="dxa" w:w="4680"/>
             <w:vAlign w:val="center"/>
             <w:tcMar>
-              <w:top w:w="90" w:type="dxa"/>
-              <w:bottom w:w="90" w:type="dxa"/>
-              <w:left w:w="130" w:type="dxa"/>
-              <w:right w:w="130" w:type="dxa"/>
+              <w:top w:w="70" w:type="dxa"/>
+              <w:bottom w:w="70" w:type="dxa"/>
+              <w:left w:w="100" w:type="dxa"/>
+              <w:right w:w="100" w:type="dxa"/>
             </w:tcMar>
           </w:tcPr>
           <w:p>
@@ -717,7 +701,7 @@
                 <w:rFonts w:ascii="Times New Roman" w:hAnsi="Times New Roman"/>
                 <w:b w:val="0"/>
                 <w:color w:val="000000"/>
-                <w:sz w:val="20"/>
+                <w:sz w:val="19"/>
               </w:rPr>
               <w:t>Multi-Guide Combinatorial Cohort</w:t>
             </w:r>
@@ -728,10 +712,10 @@
             <w:tcW w:type="dxa" w:w="4680"/>
             <w:vAlign w:val="center"/>
             <w:tcMar>
-              <w:top w:w="90" w:type="dxa"/>
-              <w:bottom w:w="90" w:type="dxa"/>
-              <w:left w:w="130" w:type="dxa"/>
-              <w:right w:w="130" w:type="dxa"/>
+              <w:top w:w="70" w:type="dxa"/>
+              <w:bottom w:w="70" w:type="dxa"/>
+              <w:left w:w="100" w:type="dxa"/>
+              <w:right w:w="100" w:type="dxa"/>
             </w:tcMar>
           </w:tcPr>
           <w:p>
@@ -745,7 +729,7 @@
                 <w:rFonts w:ascii="Times New Roman" w:hAnsi="Times New Roman"/>
                 <w:b w:val="0"/>
                 <w:color w:val="000000"/>
-                <w:sz w:val="20"/>
+                <w:sz w:val="19"/>
               </w:rPr>
               <w:t>83,981 cells</w:t>
             </w:r>
@@ -758,10 +742,10 @@
             <w:tcW w:type="dxa" w:w="4680"/>
             <w:vAlign w:val="center"/>
             <w:tcMar>
-              <w:top w:w="90" w:type="dxa"/>
-              <w:bottom w:w="90" w:type="dxa"/>
-              <w:left w:w="130" w:type="dxa"/>
-              <w:right w:w="130" w:type="dxa"/>
+              <w:top w:w="70" w:type="dxa"/>
+              <w:bottom w:w="70" w:type="dxa"/>
+              <w:left w:w="100" w:type="dxa"/>
+              <w:right w:w="100" w:type="dxa"/>
             </w:tcMar>
           </w:tcPr>
           <w:p>
@@ -775,7 +759,7 @@
                 <w:rFonts w:ascii="Times New Roman" w:hAnsi="Times New Roman"/>
                 <w:b w:val="0"/>
                 <w:color w:val="000000"/>
-                <w:sz w:val="20"/>
+                <w:sz w:val="19"/>
               </w:rPr>
               <w:t>Unassigned / Control Cohort</w:t>
             </w:r>
@@ -786,10 +770,10 @@
             <w:tcW w:type="dxa" w:w="4680"/>
             <w:vAlign w:val="center"/>
             <w:tcMar>
-              <w:top w:w="90" w:type="dxa"/>
-              <w:bottom w:w="90" w:type="dxa"/>
-              <w:left w:w="130" w:type="dxa"/>
-              <w:right w:w="130" w:type="dxa"/>
+              <w:top w:w="70" w:type="dxa"/>
+              <w:bottom w:w="70" w:type="dxa"/>
+              <w:left w:w="100" w:type="dxa"/>
+              <w:right w:w="100" w:type="dxa"/>
             </w:tcMar>
           </w:tcPr>
           <w:p>
@@ -803,7 +787,7 @@
                 <w:rFonts w:ascii="Times New Roman" w:hAnsi="Times New Roman"/>
                 <w:b w:val="0"/>
                 <w:color w:val="000000"/>
-                <w:sz w:val="20"/>
+                <w:sz w:val="19"/>
               </w:rPr>
               <w:t>7,767 cells</w:t>
             </w:r>
@@ -816,10 +800,10 @@
             <w:tcW w:type="dxa" w:w="4680"/>
             <w:vAlign w:val="center"/>
             <w:tcMar>
-              <w:top w:w="90" w:type="dxa"/>
-              <w:bottom w:w="90" w:type="dxa"/>
-              <w:left w:w="130" w:type="dxa"/>
-              <w:right w:w="130" w:type="dxa"/>
+              <w:top w:w="70" w:type="dxa"/>
+              <w:bottom w:w="70" w:type="dxa"/>
+              <w:left w:w="100" w:type="dxa"/>
+              <w:right w:w="100" w:type="dxa"/>
             </w:tcMar>
           </w:tcPr>
           <w:p>
@@ -833,7 +817,7 @@
                 <w:rFonts w:ascii="Times New Roman" w:hAnsi="Times New Roman"/>
                 <w:b w:val="0"/>
                 <w:color w:val="000000"/>
-                <w:sz w:val="20"/>
+                <w:sz w:val="19"/>
               </w:rPr>
               <w:t>Experimental 10x Genomics Lanes</w:t>
             </w:r>
@@ -844,10 +828,10 @@
             <w:tcW w:type="dxa" w:w="4680"/>
             <w:vAlign w:val="center"/>
             <w:tcMar>
-              <w:top w:w="90" w:type="dxa"/>
-              <w:bottom w:w="90" w:type="dxa"/>
-              <w:left w:w="130" w:type="dxa"/>
-              <w:right w:w="130" w:type="dxa"/>
+              <w:top w:w="70" w:type="dxa"/>
+              <w:bottom w:w="70" w:type="dxa"/>
+              <w:left w:w="100" w:type="dxa"/>
+              <w:right w:w="100" w:type="dxa"/>
             </w:tcMar>
           </w:tcPr>
           <w:p>
@@ -861,7 +845,7 @@
                 <w:rFonts w:ascii="Times New Roman" w:hAnsi="Times New Roman"/>
                 <w:b w:val="0"/>
                 <w:color w:val="000000"/>
-                <w:sz w:val="20"/>
+                <w:sz w:val="19"/>
               </w:rPr>
               <w:t>8 lanes (Lanes 1-8)</w:t>
             </w:r>
@@ -871,7 +855,7 @@
     </w:tbl>
     <w:p>
       <w:pPr>
-        <w:spacing w:before="80" w:after="80" w:line="276" w:lineRule="auto"/>
+        <w:spacing w:before="120" w:after="80" w:line="276" w:lineRule="auto"/>
         <w:jc w:val="both"/>
       </w:pPr>
       <w:r>
@@ -880,9 +864,9 @@
           <w:b w:val="0"/>
           <w:i w:val="0"/>
           <w:color w:val="000000"/>
-          <w:sz w:val="19"/>
+          <w:sz w:val="18"/>
         </w:rPr>
-        <w:t>Note: Single-cell libraries were generated using 10x Genomics Chromium 3' chemistry with direct guide capture across 8 lanes (Lewis et al., 2024).</w:t>
+        <w:t>Note: Single-cell libraries were generated using 10x Genomics Chromium 3' chemistry with direct guide capture across 8 lanes (Lewis et al., 2024). Full cell metadata also preserved in Supplementary Data 1.</w:t>
       </w:r>
     </w:p>
     <w:sectPr>

</xml_diff>